<commit_message>
Reconcile all weekly deck assignments
</commit_message>
<xml_diff>
--- a/STARLAB_Unit_3/Teaching Guides/Week_07_Revising Methods and Data Collection Tools.docx
+++ b/STARLAB_Unit_3/Teaching Guides/Week_07_Revising Methods and Data Collection Tools.docx
@@ -208,6 +208,12 @@
           <w:rtl w:val="0"/>
         </w:rPr>
         <w:t xml:space="preserve">Teacher Materials</w:t>
+      </w:r>
+    </w:p>
+    <w:p>
+      <w:pPr/>
+      <w:r>
+        <w:t>Deck Use: No New Deck; Revisit / Reference - Deck 8: Troubleshooting and Responsible Project Pivots</w:t>
       </w:r>
     </w:p>
     <w:p>

</xml_diff>